<commit_message>
Remove unused report and script files
</commit_message>
<xml_diff>
--- a/report/Memoria.docx
+++ b/report/Memoria.docx
@@ -4,15 +4,15 @@
   <w:body>
     <w:p>
       <w:r>
-        <w:t xml:space="preserve">Memoria </w:t>
+        <w:t>Memoria pln</w:t>
       </w:r>
-      <w:proofErr w:type="spellStart"/>
-      <w:r>
-        <w:t>pln</w:t>
-      </w:r>
-      <w:proofErr w:type="spellEnd"/>
     </w:p>
+    <w:p/>
+    <w:p/>
+    <w:p/>
     <w:sectPr>
+      <w:headerReference w:type="default" r:id="rId6"/>
+      <w:footerReference w:type="default" r:id="rId7"/>
       <w:pgSz w:w="11906" w:h="16838"/>
       <w:pgMar w:top="1417" w:right="1701" w:bottom="1417" w:left="1701" w:header="708" w:footer="708" w:gutter="0"/>
       <w:cols w:space="708"/>
@@ -20,6 +20,176 @@
     </w:sectPr>
   </w:body>
 </w:document>
+</file>
+
+<file path=word/endnotes.xml><?xml version="1.0" encoding="utf-8"?>
+<w:endnotes xmlns:wpc="http://schemas.microsoft.com/office/word/2010/wordprocessingCanvas" xmlns:cx="http://schemas.microsoft.com/office/drawing/2014/chartex" xmlns:cx1="http://schemas.microsoft.com/office/drawing/2015/9/8/chartex" xmlns:cx2="http://schemas.microsoft.com/office/drawing/2015/10/21/chartex" xmlns:cx3="http://schemas.microsoft.com/office/drawing/2016/5/9/chartex" xmlns:cx4="http://schemas.microsoft.com/office/drawing/2016/5/10/chartex" xmlns:cx5="http://schemas.microsoft.com/office/drawing/2016/5/11/chartex" xmlns:cx6="http://schemas.microsoft.com/office/drawing/2016/5/12/chartex" xmlns:cx7="http://schemas.microsoft.com/office/drawing/2016/5/13/chartex" xmlns:cx8="http://schemas.microsoft.com/office/drawing/2016/5/14/chartex" xmlns:mc="http://schemas.openxmlformats.org/markup-compatibility/2006" xmlns:aink="http://schemas.microsoft.com/office/drawing/2016/ink" xmlns:am3d="http://schemas.microsoft.com/office/drawing/2017/model3d" xmlns:o="urn:schemas-microsoft-com:office:office" xmlns:oel="http://schemas.microsoft.com/office/2019/extlst" xmlns:r="http://schemas.openxmlformats.org/officeDocument/2006/relationships" xmlns:m="http://schemas.openxmlformats.org/officeDocument/2006/math" xmlns:v="urn:schemas-microsoft-com:vml" xmlns:wp14="http://schemas.microsoft.com/office/word/2010/wordprocessingDrawing" xmlns:wp="http://schemas.openxmlformats.org/drawingml/2006/wordprocessingDrawing" xmlns:w10="urn:schemas-microsoft-com:office:word" xmlns:w="http://schemas.openxmlformats.org/wordprocessingml/2006/main" xmlns:w14="http://schemas.microsoft.com/office/word/2010/wordml" xmlns:w15="http://schemas.microsoft.com/office/word/2012/wordml" xmlns:w16cex="http://schemas.microsoft.com/office/word/2018/wordml/cex" xmlns:w16cid="http://schemas.microsoft.com/office/word/2016/wordml/cid" xmlns:w16="http://schemas.microsoft.com/office/word/2018/wordml" xmlns:w16du="http://schemas.microsoft.com/office/word/2023/wordml/word16du" xmlns:w16sdtdh="http://schemas.microsoft.com/office/word/2020/wordml/sdtdatahash" xmlns:w16sdtfl="http://schemas.microsoft.com/office/word/2024/wordml/sdtformatlock" xmlns:w16se="http://schemas.microsoft.com/office/word/2015/wordml/symex" xmlns:wpg="http://schemas.microsoft.com/office/word/2010/wordprocessingGroup" xmlns:wpi="http://schemas.microsoft.com/office/word/2010/wordprocessingInk" xmlns:wne="http://schemas.microsoft.com/office/word/2006/wordml" xmlns:wps="http://schemas.microsoft.com/office/word/2010/wordprocessingShape" mc:Ignorable="w14 w15 w16se w16cid w16 w16cex w16sdtdh w16sdtfl w16du wp14">
+  <w:endnote w:type="separator" w:id="-1">
+    <w:p>
+      <w:pPr>
+        <w:spacing w:after="0" w:line="240" w:lineRule="auto"/>
+      </w:pPr>
+      <w:r>
+        <w:separator/>
+      </w:r>
+    </w:p>
+  </w:endnote>
+  <w:endnote w:type="continuationSeparator" w:id="0">
+    <w:p>
+      <w:pPr>
+        <w:spacing w:after="0" w:line="240" w:lineRule="auto"/>
+      </w:pPr>
+      <w:r>
+        <w:continuationSeparator/>
+      </w:r>
+    </w:p>
+  </w:endnote>
+</w:endnotes>
+</file>
+
+<file path=word/footer1.xml><?xml version="1.0" encoding="utf-8"?>
+<w:ftr xmlns:wpc="http://schemas.microsoft.com/office/word/2010/wordprocessingCanvas" xmlns:cx="http://schemas.microsoft.com/office/drawing/2014/chartex" xmlns:cx1="http://schemas.microsoft.com/office/drawing/2015/9/8/chartex" xmlns:cx2="http://schemas.microsoft.com/office/drawing/2015/10/21/chartex" xmlns:cx3="http://schemas.microsoft.com/office/drawing/2016/5/9/chartex" xmlns:cx4="http://schemas.microsoft.com/office/drawing/2016/5/10/chartex" xmlns:cx5="http://schemas.microsoft.com/office/drawing/2016/5/11/chartex" xmlns:cx6="http://schemas.microsoft.com/office/drawing/2016/5/12/chartex" xmlns:cx7="http://schemas.microsoft.com/office/drawing/2016/5/13/chartex" xmlns:cx8="http://schemas.microsoft.com/office/drawing/2016/5/14/chartex" xmlns:mc="http://schemas.openxmlformats.org/markup-compatibility/2006" xmlns:aink="http://schemas.microsoft.com/office/drawing/2016/ink" xmlns:am3d="http://schemas.microsoft.com/office/drawing/2017/model3d" xmlns:o="urn:schemas-microsoft-com:office:office" xmlns:oel="http://schemas.microsoft.com/office/2019/extlst" xmlns:r="http://schemas.openxmlformats.org/officeDocument/2006/relationships" xmlns:m="http://schemas.openxmlformats.org/officeDocument/2006/math" xmlns:v="urn:schemas-microsoft-com:vml" xmlns:wp14="http://schemas.microsoft.com/office/word/2010/wordprocessingDrawing" xmlns:wp="http://schemas.openxmlformats.org/drawingml/2006/wordprocessingDrawing" xmlns:w10="urn:schemas-microsoft-com:office:word" xmlns:w="http://schemas.openxmlformats.org/wordprocessingml/2006/main" xmlns:w14="http://schemas.microsoft.com/office/word/2010/wordml" xmlns:w15="http://schemas.microsoft.com/office/word/2012/wordml" xmlns:w16cex="http://schemas.microsoft.com/office/word/2018/wordml/cex" xmlns:w16cid="http://schemas.microsoft.com/office/word/2016/wordml/cid" xmlns:w16="http://schemas.microsoft.com/office/word/2018/wordml" xmlns:w16du="http://schemas.microsoft.com/office/word/2023/wordml/word16du" xmlns:w16sdtdh="http://schemas.microsoft.com/office/word/2020/wordml/sdtdatahash" xmlns:w16sdtfl="http://schemas.microsoft.com/office/word/2024/wordml/sdtformatlock" xmlns:w16se="http://schemas.microsoft.com/office/word/2015/wordml/symex" xmlns:wpg="http://schemas.microsoft.com/office/word/2010/wordprocessingGroup" xmlns:wpi="http://schemas.microsoft.com/office/word/2010/wordprocessingInk" xmlns:wne="http://schemas.microsoft.com/office/word/2006/wordml" xmlns:wps="http://schemas.microsoft.com/office/word/2010/wordprocessingShape" mc:Ignorable="w14 w15 w16se w16cid w16 w16cex w16sdtdh w16sdtfl w16du wp14">
+  <w:tbl>
+    <w:tblPr>
+      <w:tblW w:w="0" w:type="auto"/>
+      <w:tblLook w:val="06A0" w:firstRow="1" w:lastRow="0" w:firstColumn="1" w:lastColumn="0" w:noHBand="1" w:noVBand="1"/>
+    </w:tblPr>
+    <w:tblGrid>
+      <w:gridCol w:w="2830"/>
+      <w:gridCol w:w="2830"/>
+      <w:gridCol w:w="2830"/>
+    </w:tblGrid>
+    <w:tr>
+      <w:trPr>
+        <w:trHeight w:val="300"/>
+      </w:trPr>
+      <w:tc>
+        <w:tcPr>
+          <w:tcW w:w="2830" w:type="dxa"/>
+        </w:tcPr>
+        <w:p>
+          <w:pPr>
+            <w:pStyle w:val="Header"/>
+            <w:ind w:left="-115"/>
+          </w:pPr>
+        </w:p>
+      </w:tc>
+      <w:tc>
+        <w:tcPr>
+          <w:tcW w:w="2830" w:type="dxa"/>
+        </w:tcPr>
+        <w:p>
+          <w:pPr>
+            <w:pStyle w:val="Header"/>
+            <w:jc w:val="center"/>
+          </w:pPr>
+        </w:p>
+      </w:tc>
+      <w:tc>
+        <w:tcPr>
+          <w:tcW w:w="2830" w:type="dxa"/>
+        </w:tcPr>
+        <w:p>
+          <w:pPr>
+            <w:pStyle w:val="Header"/>
+            <w:ind w:right="-115"/>
+            <w:jc w:val="right"/>
+          </w:pPr>
+        </w:p>
+      </w:tc>
+    </w:tr>
+  </w:tbl>
+  <w:p>
+    <w:pPr>
+      <w:pStyle w:val="Footer"/>
+    </w:pPr>
+  </w:p>
+</w:ftr>
+</file>
+
+<file path=word/footnotes.xml><?xml version="1.0" encoding="utf-8"?>
+<w:footnotes xmlns:wpc="http://schemas.microsoft.com/office/word/2010/wordprocessingCanvas" xmlns:cx="http://schemas.microsoft.com/office/drawing/2014/chartex" xmlns:cx1="http://schemas.microsoft.com/office/drawing/2015/9/8/chartex" xmlns:cx2="http://schemas.microsoft.com/office/drawing/2015/10/21/chartex" xmlns:cx3="http://schemas.microsoft.com/office/drawing/2016/5/9/chartex" xmlns:cx4="http://schemas.microsoft.com/office/drawing/2016/5/10/chartex" xmlns:cx5="http://schemas.microsoft.com/office/drawing/2016/5/11/chartex" xmlns:cx6="http://schemas.microsoft.com/office/drawing/2016/5/12/chartex" xmlns:cx7="http://schemas.microsoft.com/office/drawing/2016/5/13/chartex" xmlns:cx8="http://schemas.microsoft.com/office/drawing/2016/5/14/chartex" xmlns:mc="http://schemas.openxmlformats.org/markup-compatibility/2006" xmlns:aink="http://schemas.microsoft.com/office/drawing/2016/ink" xmlns:am3d="http://schemas.microsoft.com/office/drawing/2017/model3d" xmlns:o="urn:schemas-microsoft-com:office:office" xmlns:oel="http://schemas.microsoft.com/office/2019/extlst" xmlns:r="http://schemas.openxmlformats.org/officeDocument/2006/relationships" xmlns:m="http://schemas.openxmlformats.org/officeDocument/2006/math" xmlns:v="urn:schemas-microsoft-com:vml" xmlns:wp14="http://schemas.microsoft.com/office/word/2010/wordprocessingDrawing" xmlns:wp="http://schemas.openxmlformats.org/drawingml/2006/wordprocessingDrawing" xmlns:w10="urn:schemas-microsoft-com:office:word" xmlns:w="http://schemas.openxmlformats.org/wordprocessingml/2006/main" xmlns:w14="http://schemas.microsoft.com/office/word/2010/wordml" xmlns:w15="http://schemas.microsoft.com/office/word/2012/wordml" xmlns:w16cex="http://schemas.microsoft.com/office/word/2018/wordml/cex" xmlns:w16cid="http://schemas.microsoft.com/office/word/2016/wordml/cid" xmlns:w16="http://schemas.microsoft.com/office/word/2018/wordml" xmlns:w16du="http://schemas.microsoft.com/office/word/2023/wordml/word16du" xmlns:w16sdtdh="http://schemas.microsoft.com/office/word/2020/wordml/sdtdatahash" xmlns:w16sdtfl="http://schemas.microsoft.com/office/word/2024/wordml/sdtformatlock" xmlns:w16se="http://schemas.microsoft.com/office/word/2015/wordml/symex" xmlns:wpg="http://schemas.microsoft.com/office/word/2010/wordprocessingGroup" xmlns:wpi="http://schemas.microsoft.com/office/word/2010/wordprocessingInk" xmlns:wne="http://schemas.microsoft.com/office/word/2006/wordml" xmlns:wps="http://schemas.microsoft.com/office/word/2010/wordprocessingShape" mc:Ignorable="w14 w15 w16se w16cid w16 w16cex w16sdtdh w16sdtfl w16du wp14">
+  <w:footnote w:type="separator" w:id="-1">
+    <w:p>
+      <w:pPr>
+        <w:spacing w:after="0" w:line="240" w:lineRule="auto"/>
+      </w:pPr>
+      <w:r>
+        <w:separator/>
+      </w:r>
+    </w:p>
+  </w:footnote>
+  <w:footnote w:type="continuationSeparator" w:id="0">
+    <w:p>
+      <w:pPr>
+        <w:spacing w:after="0" w:line="240" w:lineRule="auto"/>
+      </w:pPr>
+      <w:r>
+        <w:continuationSeparator/>
+      </w:r>
+    </w:p>
+  </w:footnote>
+</w:footnotes>
+</file>
+
+<file path=word/header1.xml><?xml version="1.0" encoding="utf-8"?>
+<w:hdr xmlns:wpc="http://schemas.microsoft.com/office/word/2010/wordprocessingCanvas" xmlns:cx="http://schemas.microsoft.com/office/drawing/2014/chartex" xmlns:cx1="http://schemas.microsoft.com/office/drawing/2015/9/8/chartex" xmlns:cx2="http://schemas.microsoft.com/office/drawing/2015/10/21/chartex" xmlns:cx3="http://schemas.microsoft.com/office/drawing/2016/5/9/chartex" xmlns:cx4="http://schemas.microsoft.com/office/drawing/2016/5/10/chartex" xmlns:cx5="http://schemas.microsoft.com/office/drawing/2016/5/11/chartex" xmlns:cx6="http://schemas.microsoft.com/office/drawing/2016/5/12/chartex" xmlns:cx7="http://schemas.microsoft.com/office/drawing/2016/5/13/chartex" xmlns:cx8="http://schemas.microsoft.com/office/drawing/2016/5/14/chartex" xmlns:mc="http://schemas.openxmlformats.org/markup-compatibility/2006" xmlns:aink="http://schemas.microsoft.com/office/drawing/2016/ink" xmlns:am3d="http://schemas.microsoft.com/office/drawing/2017/model3d" xmlns:o="urn:schemas-microsoft-com:office:office" xmlns:oel="http://schemas.microsoft.com/office/2019/extlst" xmlns:r="http://schemas.openxmlformats.org/officeDocument/2006/relationships" xmlns:m="http://schemas.openxmlformats.org/officeDocument/2006/math" xmlns:v="urn:schemas-microsoft-com:vml" xmlns:wp14="http://schemas.microsoft.com/office/word/2010/wordprocessingDrawing" xmlns:wp="http://schemas.openxmlformats.org/drawingml/2006/wordprocessingDrawing" xmlns:w10="urn:schemas-microsoft-com:office:word" xmlns:w="http://schemas.openxmlformats.org/wordprocessingml/2006/main" xmlns:w14="http://schemas.microsoft.com/office/word/2010/wordml" xmlns:w15="http://schemas.microsoft.com/office/word/2012/wordml" xmlns:w16cex="http://schemas.microsoft.com/office/word/2018/wordml/cex" xmlns:w16cid="http://schemas.microsoft.com/office/word/2016/wordml/cid" xmlns:w16="http://schemas.microsoft.com/office/word/2018/wordml" xmlns:w16du="http://schemas.microsoft.com/office/word/2023/wordml/word16du" xmlns:w16sdtdh="http://schemas.microsoft.com/office/word/2020/wordml/sdtdatahash" xmlns:w16sdtfl="http://schemas.microsoft.com/office/word/2024/wordml/sdtformatlock" xmlns:w16se="http://schemas.microsoft.com/office/word/2015/wordml/symex" xmlns:wpg="http://schemas.microsoft.com/office/word/2010/wordprocessingGroup" xmlns:wpi="http://schemas.microsoft.com/office/word/2010/wordprocessingInk" xmlns:wne="http://schemas.microsoft.com/office/word/2006/wordml" xmlns:wps="http://schemas.microsoft.com/office/word/2010/wordprocessingShape" mc:Ignorable="w14 w15 w16se w16cid w16 w16cex w16sdtdh w16sdtfl w16du wp14">
+  <w:tbl>
+    <w:tblPr>
+      <w:tblW w:w="0" w:type="auto"/>
+      <w:tblLook w:val="06A0" w:firstRow="1" w:lastRow="0" w:firstColumn="1" w:lastColumn="0" w:noHBand="1" w:noVBand="1"/>
+    </w:tblPr>
+    <w:tblGrid>
+      <w:gridCol w:w="2830"/>
+      <w:gridCol w:w="2830"/>
+      <w:gridCol w:w="2830"/>
+    </w:tblGrid>
+    <w:tr>
+      <w:trPr>
+        <w:trHeight w:val="300"/>
+      </w:trPr>
+      <w:tc>
+        <w:tcPr>
+          <w:tcW w:w="2830" w:type="dxa"/>
+        </w:tcPr>
+        <w:p>
+          <w:pPr>
+            <w:pStyle w:val="Header"/>
+            <w:ind w:left="-115"/>
+          </w:pPr>
+        </w:p>
+      </w:tc>
+      <w:tc>
+        <w:tcPr>
+          <w:tcW w:w="2830" w:type="dxa"/>
+        </w:tcPr>
+        <w:p>
+          <w:pPr>
+            <w:pStyle w:val="Header"/>
+            <w:jc w:val="center"/>
+          </w:pPr>
+        </w:p>
+      </w:tc>
+      <w:tc>
+        <w:tcPr>
+          <w:tcW w:w="2830" w:type="dxa"/>
+        </w:tcPr>
+        <w:p>
+          <w:pPr>
+            <w:pStyle w:val="Header"/>
+            <w:ind w:right="-115"/>
+            <w:jc w:val="right"/>
+          </w:pPr>
+        </w:p>
+      </w:tc>
+    </w:tr>
+  </w:tbl>
+  <w:p>
+    <w:pPr>
+      <w:pStyle w:val="Header"/>
+    </w:pPr>
+  </w:p>
+</w:hdr>
 </file>
 
 <file path=word/styles.xml><?xml version="1.0" encoding="utf-8"?>
@@ -423,11 +593,11 @@
     <w:name w:val="Normal"/>
     <w:qFormat/>
   </w:style>
-  <w:style w:type="paragraph" w:styleId="Ttulo1">
+  <w:style w:type="paragraph" w:styleId="Heading1">
     <w:name w:val="heading 1"/>
     <w:basedOn w:val="Normal"/>
     <w:next w:val="Normal"/>
-    <w:link w:val="Ttulo1Car"/>
+    <w:link w:val="Heading1Char"/>
     <w:uiPriority w:val="9"/>
     <w:qFormat/>
     <w:rsid w:val="00FC1E37"/>
@@ -444,11 +614,11 @@
       <w:szCs w:val="40"/>
     </w:rPr>
   </w:style>
-  <w:style w:type="paragraph" w:styleId="Ttulo2">
+  <w:style w:type="paragraph" w:styleId="Heading2">
     <w:name w:val="heading 2"/>
     <w:basedOn w:val="Normal"/>
     <w:next w:val="Normal"/>
-    <w:link w:val="Ttulo2Car"/>
+    <w:link w:val="Heading2Char"/>
     <w:uiPriority w:val="9"/>
     <w:semiHidden/>
     <w:unhideWhenUsed/>
@@ -467,11 +637,11 @@
       <w:szCs w:val="32"/>
     </w:rPr>
   </w:style>
-  <w:style w:type="paragraph" w:styleId="Ttulo3">
+  <w:style w:type="paragraph" w:styleId="Heading3">
     <w:name w:val="heading 3"/>
     <w:basedOn w:val="Normal"/>
     <w:next w:val="Normal"/>
-    <w:link w:val="Ttulo3Car"/>
+    <w:link w:val="Heading3Char"/>
     <w:uiPriority w:val="9"/>
     <w:semiHidden/>
     <w:unhideWhenUsed/>
@@ -490,11 +660,11 @@
       <w:szCs w:val="28"/>
     </w:rPr>
   </w:style>
-  <w:style w:type="paragraph" w:styleId="Ttulo4">
+  <w:style w:type="paragraph" w:styleId="Heading4">
     <w:name w:val="heading 4"/>
     <w:basedOn w:val="Normal"/>
     <w:next w:val="Normal"/>
-    <w:link w:val="Ttulo4Car"/>
+    <w:link w:val="Heading4Char"/>
     <w:uiPriority w:val="9"/>
     <w:semiHidden/>
     <w:unhideWhenUsed/>
@@ -513,11 +683,11 @@
       <w:color w:val="0F4761" w:themeColor="accent1" w:themeShade="BF"/>
     </w:rPr>
   </w:style>
-  <w:style w:type="paragraph" w:styleId="Ttulo5">
+  <w:style w:type="paragraph" w:styleId="Heading5">
     <w:name w:val="heading 5"/>
     <w:basedOn w:val="Normal"/>
     <w:next w:val="Normal"/>
-    <w:link w:val="Ttulo5Car"/>
+    <w:link w:val="Heading5Char"/>
     <w:uiPriority w:val="9"/>
     <w:semiHidden/>
     <w:unhideWhenUsed/>
@@ -534,11 +704,11 @@
       <w:color w:val="0F4761" w:themeColor="accent1" w:themeShade="BF"/>
     </w:rPr>
   </w:style>
-  <w:style w:type="paragraph" w:styleId="Ttulo6">
+  <w:style w:type="paragraph" w:styleId="Heading6">
     <w:name w:val="heading 6"/>
     <w:basedOn w:val="Normal"/>
     <w:next w:val="Normal"/>
-    <w:link w:val="Ttulo6Car"/>
+    <w:link w:val="Heading6Char"/>
     <w:uiPriority w:val="9"/>
     <w:semiHidden/>
     <w:unhideWhenUsed/>
@@ -557,11 +727,11 @@
       <w:color w:val="595959" w:themeColor="text1" w:themeTint="A6"/>
     </w:rPr>
   </w:style>
-  <w:style w:type="paragraph" w:styleId="Ttulo7">
+  <w:style w:type="paragraph" w:styleId="Heading7">
     <w:name w:val="heading 7"/>
     <w:basedOn w:val="Normal"/>
     <w:next w:val="Normal"/>
-    <w:link w:val="Ttulo7Car"/>
+    <w:link w:val="Heading7Char"/>
     <w:uiPriority w:val="9"/>
     <w:semiHidden/>
     <w:unhideWhenUsed/>
@@ -578,11 +748,11 @@
       <w:color w:val="595959" w:themeColor="text1" w:themeTint="A6"/>
     </w:rPr>
   </w:style>
-  <w:style w:type="paragraph" w:styleId="Ttulo8">
+  <w:style w:type="paragraph" w:styleId="Heading8">
     <w:name w:val="heading 8"/>
     <w:basedOn w:val="Normal"/>
     <w:next w:val="Normal"/>
-    <w:link w:val="Ttulo8Car"/>
+    <w:link w:val="Heading8Char"/>
     <w:uiPriority w:val="9"/>
     <w:semiHidden/>
     <w:unhideWhenUsed/>
@@ -601,11 +771,11 @@
       <w:color w:val="272727" w:themeColor="text1" w:themeTint="D8"/>
     </w:rPr>
   </w:style>
-  <w:style w:type="paragraph" w:styleId="Ttulo9">
+  <w:style w:type="paragraph" w:styleId="Heading9">
     <w:name w:val="heading 9"/>
     <w:basedOn w:val="Normal"/>
     <w:next w:val="Normal"/>
-    <w:link w:val="Ttulo9Car"/>
+    <w:link w:val="Heading9Char"/>
     <w:uiPriority w:val="9"/>
     <w:semiHidden/>
     <w:unhideWhenUsed/>
@@ -622,13 +792,13 @@
       <w:color w:val="272727" w:themeColor="text1" w:themeTint="D8"/>
     </w:rPr>
   </w:style>
-  <w:style w:type="character" w:default="1" w:styleId="Fuentedeprrafopredeter">
+  <w:style w:type="character" w:default="1" w:styleId="DefaultParagraphFont">
     <w:name w:val="Default Paragraph Font"/>
     <w:uiPriority w:val="1"/>
     <w:semiHidden/>
     <w:unhideWhenUsed/>
   </w:style>
-  <w:style w:type="table" w:default="1" w:styleId="Tablanormal">
+  <w:style w:type="table" w:default="1" w:styleId="TableNormal">
     <w:name w:val="Normal Table"/>
     <w:uiPriority w:val="99"/>
     <w:semiHidden/>
@@ -643,16 +813,16 @@
       </w:tblCellMar>
     </w:tblPr>
   </w:style>
-  <w:style w:type="numbering" w:default="1" w:styleId="Sinlista">
+  <w:style w:type="numbering" w:default="1" w:styleId="NoList">
     <w:name w:val="No List"/>
     <w:uiPriority w:val="99"/>
     <w:semiHidden/>
     <w:unhideWhenUsed/>
   </w:style>
-  <w:style w:type="character" w:customStyle="1" w:styleId="Ttulo1Car">
-    <w:name w:val="Título 1 Car"/>
-    <w:basedOn w:val="Fuentedeprrafopredeter"/>
-    <w:link w:val="Ttulo1"/>
+  <w:style w:type="character" w:customStyle="1" w:styleId="Heading1Char">
+    <w:name w:val="Heading 1 Char"/>
+    <w:basedOn w:val="DefaultParagraphFont"/>
+    <w:link w:val="Heading1"/>
     <w:uiPriority w:val="9"/>
     <w:rsid w:val="00FC1E37"/>
     <w:rPr>
@@ -662,10 +832,10 @@
       <w:szCs w:val="40"/>
     </w:rPr>
   </w:style>
-  <w:style w:type="character" w:customStyle="1" w:styleId="Ttulo2Car">
-    <w:name w:val="Título 2 Car"/>
-    <w:basedOn w:val="Fuentedeprrafopredeter"/>
-    <w:link w:val="Ttulo2"/>
+  <w:style w:type="character" w:customStyle="1" w:styleId="Heading2Char">
+    <w:name w:val="Heading 2 Char"/>
+    <w:basedOn w:val="DefaultParagraphFont"/>
+    <w:link w:val="Heading2"/>
     <w:uiPriority w:val="9"/>
     <w:semiHidden/>
     <w:rsid w:val="00FC1E37"/>
@@ -676,10 +846,10 @@
       <w:szCs w:val="32"/>
     </w:rPr>
   </w:style>
-  <w:style w:type="character" w:customStyle="1" w:styleId="Ttulo3Car">
-    <w:name w:val="Título 3 Car"/>
-    <w:basedOn w:val="Fuentedeprrafopredeter"/>
-    <w:link w:val="Ttulo3"/>
+  <w:style w:type="character" w:customStyle="1" w:styleId="Heading3Char">
+    <w:name w:val="Heading 3 Char"/>
+    <w:basedOn w:val="DefaultParagraphFont"/>
+    <w:link w:val="Heading3"/>
     <w:uiPriority w:val="9"/>
     <w:semiHidden/>
     <w:rsid w:val="00FC1E37"/>
@@ -690,10 +860,10 @@
       <w:szCs w:val="28"/>
     </w:rPr>
   </w:style>
-  <w:style w:type="character" w:customStyle="1" w:styleId="Ttulo4Car">
-    <w:name w:val="Título 4 Car"/>
-    <w:basedOn w:val="Fuentedeprrafopredeter"/>
-    <w:link w:val="Ttulo4"/>
+  <w:style w:type="character" w:customStyle="1" w:styleId="Heading4Char">
+    <w:name w:val="Heading 4 Char"/>
+    <w:basedOn w:val="DefaultParagraphFont"/>
+    <w:link w:val="Heading4"/>
     <w:uiPriority w:val="9"/>
     <w:semiHidden/>
     <w:rsid w:val="00FC1E37"/>
@@ -704,10 +874,10 @@
       <w:color w:val="0F4761" w:themeColor="accent1" w:themeShade="BF"/>
     </w:rPr>
   </w:style>
-  <w:style w:type="character" w:customStyle="1" w:styleId="Ttulo5Car">
-    <w:name w:val="Título 5 Car"/>
-    <w:basedOn w:val="Fuentedeprrafopredeter"/>
-    <w:link w:val="Ttulo5"/>
+  <w:style w:type="character" w:customStyle="1" w:styleId="Heading5Char">
+    <w:name w:val="Heading 5 Char"/>
+    <w:basedOn w:val="DefaultParagraphFont"/>
+    <w:link w:val="Heading5"/>
     <w:uiPriority w:val="9"/>
     <w:semiHidden/>
     <w:rsid w:val="00FC1E37"/>
@@ -716,10 +886,10 @@
       <w:color w:val="0F4761" w:themeColor="accent1" w:themeShade="BF"/>
     </w:rPr>
   </w:style>
-  <w:style w:type="character" w:customStyle="1" w:styleId="Ttulo6Car">
-    <w:name w:val="Título 6 Car"/>
-    <w:basedOn w:val="Fuentedeprrafopredeter"/>
-    <w:link w:val="Ttulo6"/>
+  <w:style w:type="character" w:customStyle="1" w:styleId="Heading6Char">
+    <w:name w:val="Heading 6 Char"/>
+    <w:basedOn w:val="DefaultParagraphFont"/>
+    <w:link w:val="Heading6"/>
     <w:uiPriority w:val="9"/>
     <w:semiHidden/>
     <w:rsid w:val="00FC1E37"/>
@@ -730,10 +900,10 @@
       <w:color w:val="595959" w:themeColor="text1" w:themeTint="A6"/>
     </w:rPr>
   </w:style>
-  <w:style w:type="character" w:customStyle="1" w:styleId="Ttulo7Car">
-    <w:name w:val="Título 7 Car"/>
-    <w:basedOn w:val="Fuentedeprrafopredeter"/>
-    <w:link w:val="Ttulo7"/>
+  <w:style w:type="character" w:customStyle="1" w:styleId="Heading7Char">
+    <w:name w:val="Heading 7 Char"/>
+    <w:basedOn w:val="DefaultParagraphFont"/>
+    <w:link w:val="Heading7"/>
     <w:uiPriority w:val="9"/>
     <w:semiHidden/>
     <w:rsid w:val="00FC1E37"/>
@@ -742,10 +912,10 @@
       <w:color w:val="595959" w:themeColor="text1" w:themeTint="A6"/>
     </w:rPr>
   </w:style>
-  <w:style w:type="character" w:customStyle="1" w:styleId="Ttulo8Car">
-    <w:name w:val="Título 8 Car"/>
-    <w:basedOn w:val="Fuentedeprrafopredeter"/>
-    <w:link w:val="Ttulo8"/>
+  <w:style w:type="character" w:customStyle="1" w:styleId="Heading8Char">
+    <w:name w:val="Heading 8 Char"/>
+    <w:basedOn w:val="DefaultParagraphFont"/>
+    <w:link w:val="Heading8"/>
     <w:uiPriority w:val="9"/>
     <w:semiHidden/>
     <w:rsid w:val="00FC1E37"/>
@@ -756,10 +926,10 @@
       <w:color w:val="272727" w:themeColor="text1" w:themeTint="D8"/>
     </w:rPr>
   </w:style>
-  <w:style w:type="character" w:customStyle="1" w:styleId="Ttulo9Car">
-    <w:name w:val="Título 9 Car"/>
-    <w:basedOn w:val="Fuentedeprrafopredeter"/>
-    <w:link w:val="Ttulo9"/>
+  <w:style w:type="character" w:customStyle="1" w:styleId="Heading9Char">
+    <w:name w:val="Heading 9 Char"/>
+    <w:basedOn w:val="DefaultParagraphFont"/>
+    <w:link w:val="Heading9"/>
     <w:uiPriority w:val="9"/>
     <w:semiHidden/>
     <w:rsid w:val="00FC1E37"/>
@@ -768,11 +938,11 @@
       <w:color w:val="272727" w:themeColor="text1" w:themeTint="D8"/>
     </w:rPr>
   </w:style>
-  <w:style w:type="paragraph" w:styleId="Ttulo">
+  <w:style w:type="paragraph" w:styleId="Title">
     <w:name w:val="Title"/>
     <w:basedOn w:val="Normal"/>
     <w:next w:val="Normal"/>
-    <w:link w:val="TtuloCar"/>
+    <w:link w:val="TitleChar"/>
     <w:uiPriority w:val="10"/>
     <w:qFormat/>
     <w:rsid w:val="00FC1E37"/>
@@ -788,10 +958,10 @@
       <w:szCs w:val="56"/>
     </w:rPr>
   </w:style>
-  <w:style w:type="character" w:customStyle="1" w:styleId="TtuloCar">
-    <w:name w:val="Título Car"/>
-    <w:basedOn w:val="Fuentedeprrafopredeter"/>
-    <w:link w:val="Ttulo"/>
+  <w:style w:type="character" w:customStyle="1" w:styleId="TitleChar">
+    <w:name w:val="Title Char"/>
+    <w:basedOn w:val="DefaultParagraphFont"/>
+    <w:link w:val="Title"/>
     <w:uiPriority w:val="10"/>
     <w:rsid w:val="00FC1E37"/>
     <w:rPr>
@@ -802,11 +972,11 @@
       <w:szCs w:val="56"/>
     </w:rPr>
   </w:style>
-  <w:style w:type="paragraph" w:styleId="Subttulo">
+  <w:style w:type="paragraph" w:styleId="Subtitle">
     <w:name w:val="Subtitle"/>
     <w:basedOn w:val="Normal"/>
     <w:next w:val="Normal"/>
-    <w:link w:val="SubttuloCar"/>
+    <w:link w:val="SubtitleChar"/>
     <w:uiPriority w:val="11"/>
     <w:qFormat/>
     <w:rsid w:val="00FC1E37"/>
@@ -823,10 +993,10 @@
       <w:szCs w:val="28"/>
     </w:rPr>
   </w:style>
-  <w:style w:type="character" w:customStyle="1" w:styleId="SubttuloCar">
-    <w:name w:val="Subtítulo Car"/>
-    <w:basedOn w:val="Fuentedeprrafopredeter"/>
-    <w:link w:val="Subttulo"/>
+  <w:style w:type="character" w:customStyle="1" w:styleId="SubtitleChar">
+    <w:name w:val="Subtitle Char"/>
+    <w:basedOn w:val="DefaultParagraphFont"/>
+    <w:link w:val="Subtitle"/>
     <w:uiPriority w:val="11"/>
     <w:rsid w:val="00FC1E37"/>
     <w:rPr>
@@ -837,11 +1007,11 @@
       <w:szCs w:val="28"/>
     </w:rPr>
   </w:style>
-  <w:style w:type="paragraph" w:styleId="Cita">
+  <w:style w:type="paragraph" w:styleId="Quote">
     <w:name w:val="Quote"/>
     <w:basedOn w:val="Normal"/>
     <w:next w:val="Normal"/>
-    <w:link w:val="CitaCar"/>
+    <w:link w:val="QuoteChar"/>
     <w:uiPriority w:val="29"/>
     <w:qFormat/>
     <w:rsid w:val="00FC1E37"/>
@@ -855,10 +1025,10 @@
       <w:color w:val="404040" w:themeColor="text1" w:themeTint="BF"/>
     </w:rPr>
   </w:style>
-  <w:style w:type="character" w:customStyle="1" w:styleId="CitaCar">
-    <w:name w:val="Cita Car"/>
-    <w:basedOn w:val="Fuentedeprrafopredeter"/>
-    <w:link w:val="Cita"/>
+  <w:style w:type="character" w:customStyle="1" w:styleId="QuoteChar">
+    <w:name w:val="Quote Char"/>
+    <w:basedOn w:val="DefaultParagraphFont"/>
+    <w:link w:val="Quote"/>
     <w:uiPriority w:val="29"/>
     <w:rsid w:val="00FC1E37"/>
     <w:rPr>
@@ -867,7 +1037,7 @@
       <w:color w:val="404040" w:themeColor="text1" w:themeTint="BF"/>
     </w:rPr>
   </w:style>
-  <w:style w:type="paragraph" w:styleId="Prrafodelista">
+  <w:style w:type="paragraph" w:styleId="ListParagraph">
     <w:name w:val="List Paragraph"/>
     <w:basedOn w:val="Normal"/>
     <w:uiPriority w:val="34"/>
@@ -878,9 +1048,9 @@
       <w:contextualSpacing/>
     </w:pPr>
   </w:style>
-  <w:style w:type="character" w:styleId="nfasisintenso">
+  <w:style w:type="character" w:styleId="IntenseEmphasis">
     <w:name w:val="Intense Emphasis"/>
-    <w:basedOn w:val="Fuentedeprrafopredeter"/>
+    <w:basedOn w:val="DefaultParagraphFont"/>
     <w:uiPriority w:val="21"/>
     <w:qFormat/>
     <w:rsid w:val="00FC1E37"/>
@@ -890,11 +1060,11 @@
       <w:color w:val="0F4761" w:themeColor="accent1" w:themeShade="BF"/>
     </w:rPr>
   </w:style>
-  <w:style w:type="paragraph" w:styleId="Citadestacada">
+  <w:style w:type="paragraph" w:styleId="IntenseQuote">
     <w:name w:val="Intense Quote"/>
     <w:basedOn w:val="Normal"/>
     <w:next w:val="Normal"/>
-    <w:link w:val="CitadestacadaCar"/>
+    <w:link w:val="IntenseQuoteChar"/>
     <w:uiPriority w:val="30"/>
     <w:qFormat/>
     <w:rsid w:val="00FC1E37"/>
@@ -913,10 +1083,10 @@
       <w:color w:val="0F4761" w:themeColor="accent1" w:themeShade="BF"/>
     </w:rPr>
   </w:style>
-  <w:style w:type="character" w:customStyle="1" w:styleId="CitadestacadaCar">
-    <w:name w:val="Cita destacada Car"/>
-    <w:basedOn w:val="Fuentedeprrafopredeter"/>
-    <w:link w:val="Citadestacada"/>
+  <w:style w:type="character" w:customStyle="1" w:styleId="IntenseQuoteChar">
+    <w:name w:val="Intense Quote Char"/>
+    <w:basedOn w:val="DefaultParagraphFont"/>
+    <w:link w:val="IntenseQuote"/>
     <w:uiPriority w:val="30"/>
     <w:rsid w:val="00FC1E37"/>
     <w:rPr>
@@ -925,9 +1095,9 @@
       <w:color w:val="0F4761" w:themeColor="accent1" w:themeShade="BF"/>
     </w:rPr>
   </w:style>
-  <w:style w:type="character" w:styleId="Referenciaintensa">
+  <w:style w:type="character" w:styleId="IntenseReference">
     <w:name w:val="Intense Reference"/>
-    <w:basedOn w:val="Fuentedeprrafopredeter"/>
+    <w:basedOn w:val="DefaultParagraphFont"/>
     <w:uiPriority w:val="32"/>
     <w:qFormat/>
     <w:rsid w:val="00FC1E37"/>
@@ -938,6 +1108,53 @@
       <w:color w:val="0F4761" w:themeColor="accent1" w:themeShade="BF"/>
       <w:spacing w:val="5"/>
     </w:rPr>
+  </w:style>
+  <w:style w:type="paragraph" w:styleId="Header">
+    <w:name w:val="header"/>
+    <w:basedOn w:val="Normal"/>
+    <w:uiPriority w:val="99"/>
+    <w:unhideWhenUsed/>
+    <w:rsid w:val="46737656"/>
+    <w:pPr>
+      <w:tabs>
+        <w:tab w:val="center" w:pos="4680"/>
+        <w:tab w:val="right" w:pos="9360"/>
+      </w:tabs>
+      <w:spacing w:after="0" w:line="240" w:lineRule="auto"/>
+    </w:pPr>
+  </w:style>
+  <w:style w:type="paragraph" w:styleId="Footer">
+    <w:name w:val="footer"/>
+    <w:basedOn w:val="Normal"/>
+    <w:uiPriority w:val="99"/>
+    <w:unhideWhenUsed/>
+    <w:rsid w:val="46737656"/>
+    <w:pPr>
+      <w:tabs>
+        <w:tab w:val="center" w:pos="4680"/>
+        <w:tab w:val="right" w:pos="9360"/>
+      </w:tabs>
+      <w:spacing w:after="0" w:line="240" w:lineRule="auto"/>
+    </w:pPr>
+  </w:style>
+  <w:style w:type="table" w:styleId="TableGrid">
+    <w:name w:val="Table Grid"/>
+    <w:basedOn w:val="TableNormal"/>
+    <w:uiPriority w:val="59"/>
+    <w:rsid w:val="00FB4123"/>
+    <w:pPr>
+      <w:spacing w:after="0" w:line="240" w:lineRule="auto"/>
+    </w:pPr>
+    <w:tblPr>
+      <w:tblBorders>
+        <w:top w:val="single" w:sz="4" w:space="0" w:color="000000" w:themeColor="text1"/>
+        <w:left w:val="single" w:sz="4" w:space="0" w:color="000000" w:themeColor="text1"/>
+        <w:bottom w:val="single" w:sz="4" w:space="0" w:color="000000" w:themeColor="text1"/>
+        <w:right w:val="single" w:sz="4" w:space="0" w:color="000000" w:themeColor="text1"/>
+        <w:insideH w:val="single" w:sz="4" w:space="0" w:color="000000" w:themeColor="text1"/>
+        <w:insideV w:val="single" w:sz="4" w:space="0" w:color="000000" w:themeColor="text1"/>
+      </w:tblBorders>
+    </w:tblPr>
   </w:style>
 </w:styles>
 </file>

</xml_diff>